<commit_message>
docs: Early September release plan
Adds the Early September plan, written from a direct read of the source rather
than from the August review, with the figures computed from the shipping
constants instead of estimated. Nine sections:

- where the August recommendations actually landed (six of eight shipped)
- the Pearl economy dead-ending at ~40 runs, since owning everything costs
  10,000 Pearls and a good run pays about 255
- Endless capping every dial except speed at level 31
- the store carrying no real-money surface at all
- story, which is one intro screen and then banner text
- modifiers, animated backgrounds and per-depth artwork
- measurement, which the project has none of
- seven outstanding launch blockers
- an eleven-step sequence putting revenue work before content work

Also commits a Word resave of the August review. Its paragraph text is
unchanged - the diff is run re-chunking and revision ids.

Co-Authored-By: Claude Opus 5 <noreply@anthropic.com>
</commit_message>
<xml_diff>
--- a/Release Progress Plans/Gameplay, Monetisation & Retention Review.docx
+++ b/Release Progress Plans/Gameplay, Monetisation & Retention Review.docx
@@ -190,8 +190,14 @@
           <w:numId w:val="2"/>
         </w:numPr>
         <w:spacing w:after="100"/>
-      </w:pPr>
-      <w:r>
+        <w:rPr>
+          <w:highlight w:val="yellow"/>
+        </w:rPr>
+      </w:pPr>
+      <w:r>
+        <w:rPr>
+          <w:highlight w:val="yellow"/>
+        </w:rPr>
         <w:t>Add a soft currency earned every run (e.g. shells) and permanent unlocks to spend it on — cosmetic dolphin skins and trails to begin with. Almost every retention and monetisation lever below depends on this economy existing, so it should come first.</w:t>
       </w:r>
     </w:p>
@@ -203,16 +209,28 @@
           <w:numId w:val="2"/>
         </w:numPr>
         <w:spacing w:after="100"/>
-      </w:pPr>
-      <w:r>
+        <w:rPr>
+          <w:highlight w:val="yellow"/>
+        </w:rPr>
+      </w:pPr>
+      <w:r>
+        <w:rPr>
+          <w:highlight w:val="yellow"/>
+        </w:rPr>
         <w:t xml:space="preserve">Integrate Play Games Services for cloud leaderboards, achievements, and cloud save. It is free, native to Android, and needs no backend. The leaderboards are currently </w:t>
       </w:r>
       <w:proofErr w:type="spellStart"/>
       <w:r>
+        <w:rPr>
+          <w:highlight w:val="yellow"/>
+        </w:rPr>
         <w:t>localStorage</w:t>
       </w:r>
       <w:proofErr w:type="spellEnd"/>
       <w:r>
+        <w:rPr>
+          <w:highlight w:val="yellow"/>
+        </w:rPr>
         <w:t>-only, which removes any competitive reason to keep playing.</w:t>
       </w:r>
     </w:p>
@@ -224,24 +242,42 @@
           <w:numId w:val="2"/>
         </w:numPr>
         <w:spacing w:after="100"/>
-      </w:pPr>
-      <w:r>
+        <w:rPr>
+          <w:highlight w:val="yellow"/>
+        </w:rPr>
+      </w:pPr>
+      <w:r>
+        <w:rPr>
+          <w:highlight w:val="yellow"/>
+        </w:rPr>
         <w:t xml:space="preserve">Add a </w:t>
       </w:r>
       <w:proofErr w:type="gramStart"/>
       <w:r>
+        <w:rPr>
+          <w:highlight w:val="yellow"/>
+        </w:rPr>
         <w:t>rewarded-ad</w:t>
       </w:r>
       <w:proofErr w:type="gramEnd"/>
       <w:r>
+        <w:rPr>
+          <w:highlight w:val="yellow"/>
+        </w:rPr>
         <w:t xml:space="preserve"> “Continue” on death. </w:t>
       </w:r>
       <w:proofErr w:type="spellStart"/>
       <w:r>
+        <w:rPr>
+          <w:highlight w:val="yellow"/>
+        </w:rPr>
         <w:t>Game.gameOver</w:t>
       </w:r>
       <w:proofErr w:type="spellEnd"/>
       <w:r>
+        <w:rPr>
+          <w:highlight w:val="yellow"/>
+        </w:rPr>
         <w:t>() already branches on mode and the code comment names this as the intended hook. It is the single highest-return monetisation feature and roughly a day of work once an ad SDK is in.</w:t>
       </w:r>
     </w:p>
@@ -911,6 +947,7 @@
               <w:rPr>
                 <w:sz w:val="20"/>
                 <w:szCs w:val="20"/>
+                <w:highlight w:val="yellow"/>
               </w:rPr>
               <w:t>Gate kills behind the dash, or add a ram combo / multiplier, or require moving toward the target. Give the core verb some depth.</w:t>
             </w:r>
@@ -1457,7 +1494,15 @@
                 <w:sz w:val="20"/>
                 <w:szCs w:val="20"/>
               </w:rPr>
-              <w:t>Add score-pop numbers, hit-stop on large kills, a light screen shake, and escalating combo audio. Casual arcade games live on this layer.</w:t>
+              <w:t xml:space="preserve">Add score-pop numbers, </w:t>
+            </w:r>
+            <w:r>
+              <w:rPr>
+                <w:sz w:val="20"/>
+                <w:szCs w:val="20"/>
+                <w:highlight w:val="yellow"/>
+              </w:rPr>
+              <w:t>hit-stop on large kills, a light screen shake, and escalating combo audio. Casual arcade games live on this layer.</w:t>
             </w:r>
           </w:p>
         </w:tc>
@@ -1496,8 +1541,14 @@
           <w:numId w:val="2"/>
         </w:numPr>
         <w:spacing w:after="100"/>
-      </w:pPr>
-      <w:r>
+        <w:rPr>
+          <w:highlight w:val="yellow"/>
+        </w:rPr>
+      </w:pPr>
+      <w:r>
+        <w:rPr>
+          <w:highlight w:val="yellow"/>
+        </w:rPr>
         <w:t>Rewarded “Continue” on death. Revive on the spot with the pod intact, once per run, Endless first. The death handler is already shaped for it.</w:t>
       </w:r>
     </w:p>
@@ -1523,16 +1574,28 @@
           <w:numId w:val="2"/>
         </w:numPr>
         <w:spacing w:after="100"/>
-      </w:pPr>
-      <w:r>
+        <w:rPr>
+          <w:highlight w:val="yellow"/>
+        </w:rPr>
+      </w:pPr>
+      <w:r>
+        <w:rPr>
+          <w:highlight w:val="yellow"/>
+        </w:rPr>
         <w:t xml:space="preserve">Light interstitials — between runs only, every second or third game-over, never mid-run and </w:t>
       </w:r>
       <w:proofErr w:type="gramStart"/>
       <w:r>
+        <w:rPr>
+          <w:highlight w:val="yellow"/>
+        </w:rPr>
         <w:t>never before</w:t>
       </w:r>
       <w:proofErr w:type="gramEnd"/>
       <w:r>
+        <w:rPr>
+          <w:highlight w:val="yellow"/>
+        </w:rPr>
         <w:t xml:space="preserve"> the first run of a session. Frequency-capped.</w:t>
       </w:r>
     </w:p>
@@ -1565,24 +1628,42 @@
           <w:numId w:val="2"/>
         </w:numPr>
         <w:spacing w:after="100"/>
-      </w:pPr>
-      <w:r>
+        <w:rPr>
+          <w:highlight w:val="yellow"/>
+        </w:rPr>
+      </w:pPr>
+      <w:r>
+        <w:rPr>
+          <w:highlight w:val="yellow"/>
+        </w:rPr>
         <w:t xml:space="preserve">Cosmetic IAP — dolphin skins, trails, and pod colours, sold </w:t>
       </w:r>
       <w:proofErr w:type="gramStart"/>
       <w:r>
+        <w:rPr>
+          <w:highlight w:val="yellow"/>
+        </w:rPr>
         <w:t>and also</w:t>
       </w:r>
       <w:proofErr w:type="gramEnd"/>
       <w:r>
+        <w:rPr>
+          <w:highlight w:val="yellow"/>
+        </w:rPr>
         <w:t xml:space="preserve"> earnable with shells. Requires the cosmetic system to be built first; </w:t>
       </w:r>
       <w:proofErr w:type="spellStart"/>
       <w:r>
+        <w:rPr>
+          <w:highlight w:val="yellow"/>
+        </w:rPr>
         <w:t>sprites.ts</w:t>
       </w:r>
       <w:proofErr w:type="spellEnd"/>
       <w:r>
+        <w:rPr>
+          <w:highlight w:val="yellow"/>
+        </w:rPr>
         <w:t xml:space="preserve"> is entirely procedural Graphics, so a skin is a palette / parameter table and cheap to add.</w:t>
       </w:r>
     </w:p>
@@ -1672,8 +1753,14 @@
           <w:numId w:val="3"/>
         </w:numPr>
         <w:spacing w:after="80"/>
-      </w:pPr>
-      <w:r>
+        <w:rPr>
+          <w:highlight w:val="yellow"/>
+        </w:rPr>
+      </w:pPr>
+      <w:r>
+        <w:rPr>
+          <w:highlight w:val="yellow"/>
+        </w:rPr>
         <w:t>No interstitials mid-run, and none before gameplay starts.</w:t>
       </w:r>
     </w:p>
@@ -2016,8 +2103,31 @@
               <w:rPr>
                 <w:sz w:val="20"/>
                 <w:szCs w:val="20"/>
-              </w:rPr>
-              <w:t>Persistent currency plus either a small permanent upgrade tree or a cosmetic collection, and a lifetime-stats screen (dolphins saved, deepest run, campaigns cleared).</w:t>
+                <w:highlight w:val="yellow"/>
+              </w:rPr>
+              <w:t>Persistent currency plus either a small permanent</w:t>
+            </w:r>
+            <w:r>
+              <w:rPr>
+                <w:sz w:val="20"/>
+                <w:szCs w:val="20"/>
+              </w:rPr>
+              <w:t xml:space="preserve"> </w:t>
+            </w:r>
+            <w:r>
+              <w:rPr>
+                <w:sz w:val="20"/>
+                <w:szCs w:val="20"/>
+                <w:highlight w:val="yellow"/>
+              </w:rPr>
+              <w:t>upgrade tree or a cosmetic collection</w:t>
+            </w:r>
+            <w:r>
+              <w:rPr>
+                <w:sz w:val="20"/>
+                <w:szCs w:val="20"/>
+              </w:rPr>
+              <w:t>, and a lifetime-stats screen (dolphins saved, deepest run, campaigns cleared).</w:t>
             </w:r>
           </w:p>
         </w:tc>
@@ -2244,8 +2354,24 @@
               <w:rPr>
                 <w:sz w:val="20"/>
                 <w:szCs w:val="20"/>
-              </w:rPr>
-              <w:t>A proper run-summary card: time, depth, dolphins saved, sharks killed, shells earned, progress toward the next achievement, and a Share button producing an image or text. A low-cost viral loop flagged in earlier plans and still not built.</w:t>
+                <w:highlight w:val="yellow"/>
+              </w:rPr>
+              <w:t>A proper run-summary card: time, depth, dolphins saved, sharks killed, shells earned, progress toward the next achievement,</w:t>
+            </w:r>
+            <w:r>
+              <w:rPr>
+                <w:sz w:val="20"/>
+                <w:szCs w:val="20"/>
+              </w:rPr>
+              <w:t xml:space="preserve"> </w:t>
+            </w:r>
+            <w:r>
+              <w:rPr>
+                <w:sz w:val="20"/>
+                <w:szCs w:val="20"/>
+                <w:highlight w:val="yellow"/>
+              </w:rPr>
+              <w:t>and a Share button producing an image or text. A low-cost viral loop flagged in earlier plans and still not built.</w:t>
             </w:r>
           </w:p>
         </w:tc>
@@ -2396,6 +2522,7 @@
               <w:rPr>
                 <w:sz w:val="20"/>
                 <w:szCs w:val="20"/>
+                <w:highlight w:val="yellow"/>
               </w:rPr>
               <w:t>Let players name their dolphin and show that name on the summary card and the leaderboards.</w:t>
             </w:r>

</xml_diff>